<commit_message>
Clean generated analysis outputs
</commit_message>
<xml_diff>
--- a/top_censoring/lit_review/top_coding_updates.docx
+++ b/top_censoring/lit_review/top_coding_updates.docx
@@ -28623,6 +28623,7 @@
         </w:rPr>
       </w:pPr>
       <w:commentRangeStart w:id="7"/>
+      <w:commentRangeStart w:id="8"/>
       <w:r>
         <w:rPr>
           <w:rFonts w:ascii="Times New Roman" w:hAnsi="Times New Roman" w:cs="Times New Roman"/>
@@ -28687,6 +28688,19 @@
           <w:u w:val="single"/>
         </w:rPr>
         <w:commentReference w:id="7"/>
+      </w:r>
+      <w:commentRangeEnd w:id="8"/>
+      <w:r>
+        <w:rPr>
+          <w:rStyle w:val="CommentReference"/>
+          <w:rFonts w:ascii="Times New Roman" w:hAnsi="Times New Roman" w:cs="Times New Roman"/>
+          <w:b/>
+          <w:bCs/>
+          <w:sz w:val="24"/>
+          <w:szCs w:val="24"/>
+          <w:u w:val="single"/>
+        </w:rPr>
+        <w:commentReference w:id="8"/>
       </w:r>
     </w:p>
     <w:p>
@@ -28947,7 +28961,7 @@
           <w:b/>
           <w:bCs/>
         </w:rPr>
-        <w:t>To make sure this wasn't just an artifact of the LIS rule, we applied a second, independent method — Stata's outdetect procedure, reimplemented in Python</w:t>
+        <w:t xml:space="preserve">[Doing procedure with R and not with python subsetting to 2000 records] </w:t>
       </w:r>
       <w:r>
         <w:rPr>
@@ -28955,62 +28969,203 @@
           <w:b/>
           <w:bCs/>
         </w:rPr>
-        <w:t xml:space="preserve">. </w:t>
+        <w:t xml:space="preserve">To make sure this was not simply an artifact of the LIS rule, we applied a second, independent method: </w:t>
       </w:r>
       <w:r>
         <w:rPr>
           <w:rFonts w:ascii="Times New Roman" w:hAnsi="Times New Roman" w:cs="Times New Roman"/>
-        </w:rPr>
-        <w:t>O</w:t>
+          <w:b/>
+          <w:bCs/>
+        </w:rPr>
+        <w:t xml:space="preserve">Belotti, </w:t>
       </w:r>
       <w:r>
         <w:rPr>
           <w:rFonts w:ascii="Times New Roman" w:hAnsi="Times New Roman" w:cs="Times New Roman"/>
-        </w:rPr>
-        <w:t>utdetect uses an unweighted median + S-estimator (a robust scale estimator), which is methodologically distinct from LIS's log-IQR approach</w:t>
+          <w:b/>
+          <w:bCs/>
+        </w:rPr>
+        <w:t>Mancini and Vecchi’s outdetect procedure, implemented in R</w:t>
       </w:r>
       <w:r>
         <w:rPr>
           <w:rFonts w:ascii="Times New Roman" w:hAnsi="Times New Roman" w:cs="Times New Roman"/>
-        </w:rPr>
-        <w:t xml:space="preserve">. </w:t>
+          <w:b/>
+          <w:bCs/>
+        </w:rPr>
+        <w:t xml:space="preserve"> from Stata</w:t>
       </w:r>
       <w:r>
         <w:rPr>
           <w:rFonts w:ascii="Times New Roman" w:hAnsi="Times New Roman" w:cs="Times New Roman"/>
         </w:rPr>
-        <w:t>We applied the same 5% welfare-share criterion to the observations flagged by the Python implementation of Stata’s outdetect procedure. Using its recommended robust z-score threshold of 3, outdetect identified 398 surveys where flagged observations accounted for at least 5% of total welfare. All 24 surveys identified by LIS were included in this group, together with 374 additional surveys. As an alternative criterion, we used a 1% population-share threshold. This is an empirical reference</w:t>
+        <w:t xml:space="preserve"> using the exact Croux–Rousseeuw S-estimator via robustbase::Sn(). Unlike the LIS log-IQR approach, outdetect uses an unweighted median and a robust S-estimator in log-welfare space. We applied the same 5% welfare-share criterion to the observations flagged using the recommended robust z-score threshold of 3. The exact R implementation identified 399 surveys where flagged observations accounted for at least 5% of total welfare. All 24 surveys identified by LIS were included in this group, together with 375 additional surveys. As an alternative criterion, we used a 1% population-share threshold. This is an empirical reference point based on the </w:t>
       </w:r>
       <w:r>
         <w:rPr>
           <w:rFonts w:ascii="Times New Roman" w:hAnsi="Times New Roman" w:cs="Times New Roman"/>
         </w:rPr>
-        <w:t xml:space="preserve"> point</w:t>
+        <w:lastRenderedPageBreak/>
+        <w:t>outdetect documentation, not an official survey-level cutoff. Under this criterion, 151 surveys were flagged, including 4 of the 24 LIS surveys: Comoros 2004, Malawi 1997, Rwanda 2005, and Rwanda 2013.</w:t>
+      </w:r>
+    </w:p>
+    <w:p>
+      <w:pPr>
+        <w:rPr>
+          <w:rFonts w:ascii="Times New Roman" w:hAnsi="Times New Roman" w:cs="Times New Roman"/>
+        </w:rPr>
+      </w:pPr>
+      <w:r>
+        <w:rPr>
+          <w:rFonts w:ascii="Times New Roman" w:hAnsi="Times New Roman" w:cs="Times New Roman"/>
+        </w:rPr>
+        <w:t xml:space="preserve">* </w:t>
       </w:r>
       <w:r>
         <w:rPr>
           <w:rFonts w:ascii="Times New Roman" w:hAnsi="Times New Roman" w:cs="Times New Roman"/>
         </w:rPr>
-        <w:t xml:space="preserve"> based on the outdetect documentation, not an official survey-level cutoff. Under this criterion, 143 surveys were flagged, including 5 </w:t>
+        <w:t>The original Stata command is:</w:t>
       </w:r>
       <w:r>
         <w:rPr>
           <w:rFonts w:ascii="Times New Roman" w:hAnsi="Times New Roman" w:cs="Times New Roman"/>
         </w:rPr>
-        <w:lastRenderedPageBreak/>
-        <w:t xml:space="preserve">of the 24 LIS surveys: </w:t>
+        <w:t xml:space="preserve"> </w:t>
       </w:r>
       <w:r>
         <w:rPr>
           <w:rFonts w:ascii="Times New Roman" w:hAnsi="Times New Roman" w:cs="Times New Roman"/>
         </w:rPr>
-        <w:t>Comoros 2004, Malawi 1997, Rwanda 2000, Rwanda 2005, and Rwanda 2013</w:t>
+        <w:t>outdetect welfare, norm(ln) zscore(median, s) alpha(3) out(top)</w:t>
+      </w:r>
+    </w:p>
+    <w:p>
+      <w:pPr>
+        <w:rPr>
+          <w:rFonts w:ascii="Times New Roman" w:hAnsi="Times New Roman" w:cs="Times New Roman"/>
+        </w:rPr>
+      </w:pPr>
+      <w:r>
+        <w:rPr>
+          <w:rFonts w:ascii="Times New Roman" w:hAnsi="Times New Roman" w:cs="Times New Roman"/>
+        </w:rPr>
+        <w:t xml:space="preserve">* </w:t>
       </w:r>
       <w:r>
         <w:rPr>
           <w:rFonts w:ascii="Times New Roman" w:hAnsi="Times New Roman" w:cs="Times New Roman"/>
         </w:rPr>
-        <w:t>.</w:t>
+        <w:t>The equivalent R implementation follows these steps:</w:t>
+      </w:r>
+    </w:p>
+    <w:p>
+      <w:pPr>
+        <w:rPr>
+          <w:rFonts w:ascii="Times New Roman" w:hAnsi="Times New Roman" w:cs="Times New Roman"/>
+        </w:rPr>
+      </w:pPr>
+      <w:r>
+        <w:rPr>
+          <w:rFonts w:ascii="Times New Roman" w:hAnsi="Times New Roman" w:cs="Times New Roman"/>
+        </w:rPr>
+        <w:t>log_values &lt;- log(values)</w:t>
+      </w:r>
+      <w:r>
+        <w:rPr>
+          <w:rFonts w:ascii="Times New Roman" w:hAnsi="Times New Roman" w:cs="Times New Roman"/>
+        </w:rPr>
+        <w:br/>
+      </w:r>
+      <w:r>
+        <w:rPr>
+          <w:rFonts w:ascii="Times New Roman" w:hAnsi="Times New Roman" w:cs="Times New Roman"/>
+        </w:rPr>
+        <w:t>median_log &lt;- median(log_values)</w:t>
+      </w:r>
+      <w:r>
+        <w:rPr>
+          <w:rFonts w:ascii="Times New Roman" w:hAnsi="Times New Roman" w:cs="Times New Roman"/>
+        </w:rPr>
+        <w:br/>
+      </w:r>
+      <w:r>
+        <w:rPr>
+          <w:rFonts w:ascii="Times New Roman" w:hAnsi="Times New Roman" w:cs="Times New Roman"/>
+        </w:rPr>
+        <w:t>s_log &lt;- robustbase::Sn( log_values, constant = 1.1926)</w:t>
+      </w:r>
+      <w:r>
+        <w:rPr>
+          <w:rFonts w:ascii="Times New Roman" w:hAnsi="Times New Roman" w:cs="Times New Roman"/>
+        </w:rPr>
+        <w:br/>
+      </w:r>
+      <w:r>
+        <w:rPr>
+          <w:rFonts w:ascii="Times New Roman" w:hAnsi="Times New Roman" w:cs="Times New Roman"/>
+        </w:rPr>
+        <w:t>threshold &lt;- exp(median_log + 3 * s_log)</w:t>
+      </w:r>
+      <w:r>
+        <w:rPr>
+          <w:rFonts w:ascii="Times New Roman" w:hAnsi="Times New Roman" w:cs="Times New Roman"/>
+        </w:rPr>
+        <w:br/>
+      </w:r>
+      <w:r>
+        <w:rPr>
+          <w:rFonts w:ascii="Times New Roman" w:hAnsi="Times New Roman" w:cs="Times New Roman"/>
+        </w:rPr>
+        <w:t>top_flag &lt;- values &gt; threshold</w:t>
+      </w:r>
+    </w:p>
+    <w:p>
+      <w:pPr>
+        <w:rPr>
+          <w:rFonts w:ascii="Times New Roman" w:hAnsi="Times New Roman" w:cs="Times New Roman"/>
+        </w:rPr>
+      </w:pPr>
+      <w:r>
+        <w:rPr>
+          <w:rFonts w:ascii="Times New Roman" w:hAnsi="Times New Roman" w:cs="Times New Roman"/>
+          <w:noProof/>
+        </w:rPr>
+        <w:drawing>
+          <wp:inline distT="0" distB="0" distL="0" distR="0" wp14:anchorId="475CAD17" wp14:editId="41311FC5">
+            <wp:extent cx="5943600" cy="3615055"/>
+            <wp:effectExtent l="0" t="0" r="0" b="4445"/>
+            <wp:docPr id="1688370685" name="Picture 1"/>
+            <wp:cNvGraphicFramePr>
+              <a:graphicFrameLocks xmlns:a="http://schemas.openxmlformats.org/drawingml/2006/main" noChangeAspect="1"/>
+            </wp:cNvGraphicFramePr>
+            <a:graphic xmlns:a="http://schemas.openxmlformats.org/drawingml/2006/main">
+              <a:graphicData uri="http://schemas.openxmlformats.org/drawingml/2006/picture">
+                <pic:pic xmlns:pic="http://schemas.openxmlformats.org/drawingml/2006/picture">
+                  <pic:nvPicPr>
+                    <pic:cNvPr id="1688370685" name=""/>
+                    <pic:cNvPicPr/>
+                  </pic:nvPicPr>
+                  <pic:blipFill>
+                    <a:blip r:embed="rId23"/>
+                    <a:stretch>
+                      <a:fillRect/>
+                    </a:stretch>
+                  </pic:blipFill>
+                  <pic:spPr>
+                    <a:xfrm>
+                      <a:off x="0" y="0"/>
+                      <a:ext cx="5943600" cy="3615055"/>
+                    </a:xfrm>
+                    <a:prstGeom prst="rect">
+                      <a:avLst/>
+                    </a:prstGeom>
+                  </pic:spPr>
+                </pic:pic>
+              </a:graphicData>
+            </a:graphic>
+          </wp:inline>
+        </w:drawing>
       </w:r>
     </w:p>
     <w:p>
@@ -29035,7 +29190,14 @@
         <w:rPr>
           <w:rFonts w:ascii="Times New Roman" w:hAnsi="Times New Roman" w:cs="Times New Roman"/>
         </w:rPr>
-        <w:t>, using the country file MWI_1997.dta throughout. Under the LIS correction, 59 records, representing 0.43% of the weighted population, account for 41.6% of total welfare. Capping these observations reduces the mean by 38%, the Gini by 32%, the MLD by 59%, and Atkinson(2) by 33%, while removing all observations above the LIS cap produces reductions of 41%, 36%, 64%, and 38%, respectively. The outdetect correction, which caps 206 records and uses a cap of 20.22 PPP USD per person per day, produces larger reductions: capping the affected observations reduces the mean by 42%, the Gini by 37%, the MLD by 65%, and Atkinson(2) by 39%; removing them reduces the indicators by approximately 46%, 42%, 71%, and 45%. As a simpler sensitivity check, removing only the two most extreme observations reduces the mean by 34%, the Gini by 27%, the MLD by 52%, and Atkinson(2) by 28%. This shows that extreme observations substantially affect inequality and mean estimates, while poverty estimates remain comparatively stable.</w:t>
+        <w:t xml:space="preserve">, using the country file MWI_1997.dta throughout. Under the LIS correction, 59 records, representing 0.43% of the weighted population, account for 41.6% of total welfare. Capping these observations reduces the mean by 38%, the Gini by 32%, the MLD by 59%, and Atkinson(2) by 33%, while removing all observations above the LIS cap produces reductions of 41%, 36%, 64%, and 38%, respectively. The outdetect correction, which caps 206 records and uses a cap of 20.22 PPP USD per person per day, produces larger reductions: capping the affected observations reduces the mean by 42%, the Gini by 37%, the MLD by 65%, and Atkinson(2) by 39%; removing them reduces the indicators by approximately 46%, 42%, </w:t>
+      </w:r>
+      <w:r>
+        <w:rPr>
+          <w:rFonts w:ascii="Times New Roman" w:hAnsi="Times New Roman" w:cs="Times New Roman"/>
+        </w:rPr>
+        <w:lastRenderedPageBreak/>
+        <w:t>71%, and 45%. As a simpler sensitivity check, removing only the two most extreme observations reduces the mean by 34%, the Gini by 27%, the MLD by 52%, and Atkinson(2) by 28%. This shows that extreme observations substantially affect inequality and mean estimates, while poverty estimates remain comparatively stable.</w:t>
       </w:r>
     </w:p>
     <w:p>
@@ -29060,6 +29222,174 @@
       <w:r>
         <w:rPr>
           <w:rFonts w:ascii="Times New Roman" w:hAnsi="Times New Roman" w:cs="Times New Roman"/>
+          <w:b/>
+          <w:bCs/>
+        </w:rPr>
+        <w:t xml:space="preserve">The LIS and </w:t>
+      </w:r>
+      <w:r>
+        <w:rPr>
+          <w:rFonts w:ascii="Times New Roman" w:hAnsi="Times New Roman" w:cs="Times New Roman"/>
+          <w:b/>
+          <w:bCs/>
+        </w:rPr>
+        <w:t xml:space="preserve">Belotti, </w:t>
+      </w:r>
+      <w:r>
+        <w:rPr>
+          <w:rFonts w:ascii="Times New Roman" w:hAnsi="Times New Roman" w:cs="Times New Roman"/>
+          <w:b/>
+          <w:bCs/>
+        </w:rPr>
+        <w:t>Mancini</w:t>
+      </w:r>
+      <w:r>
+        <w:rPr>
+          <w:rFonts w:ascii="Times New Roman" w:hAnsi="Times New Roman" w:cs="Times New Roman"/>
+          <w:b/>
+          <w:bCs/>
+        </w:rPr>
+        <w:t xml:space="preserve"> and Vecci</w:t>
+      </w:r>
+      <w:r>
+        <w:rPr>
+          <w:rFonts w:ascii="Times New Roman" w:hAnsi="Times New Roman" w:cs="Times New Roman"/>
+          <w:b/>
+          <w:bCs/>
+        </w:rPr>
+        <w:t xml:space="preserve"> </w:t>
+      </w:r>
+      <w:r>
+        <w:rPr>
+          <w:rFonts w:ascii="Times New Roman" w:hAnsi="Times New Roman" w:cs="Times New Roman"/>
+          <w:b/>
+          <w:bCs/>
+        </w:rPr>
+        <w:t>o</w:t>
+      </w:r>
+      <w:r>
+        <w:rPr>
+          <w:rFonts w:ascii="Times New Roman" w:hAnsi="Times New Roman" w:cs="Times New Roman"/>
+          <w:b/>
+          <w:bCs/>
+        </w:rPr>
+        <w:t>utdetect</w:t>
+      </w:r>
+      <w:r>
+        <w:rPr>
+          <w:rFonts w:ascii="Times New Roman" w:hAnsi="Times New Roman" w:cs="Times New Roman"/>
+          <w:b/>
+          <w:bCs/>
+        </w:rPr>
+        <w:t xml:space="preserve"> model</w:t>
+      </w:r>
+      <w:r>
+        <w:rPr>
+          <w:rFonts w:ascii="Times New Roman" w:hAnsi="Times New Roman" w:cs="Times New Roman"/>
+          <w:b/>
+          <w:bCs/>
+        </w:rPr>
+        <w:t xml:space="preserve"> bases “extreme values” on </w:t>
+      </w:r>
+      <w:r>
+        <w:rPr>
+          <w:rFonts w:ascii="Times New Roman" w:hAnsi="Times New Roman" w:cs="Times New Roman"/>
+          <w:b/>
+          <w:bCs/>
+        </w:rPr>
+        <w:t>“well-behaved” distributions. Income (</w:t>
+      </w:r>
+      <w:r>
+        <w:rPr>
+          <w:rFonts w:ascii="Times New Roman" w:hAnsi="Times New Roman" w:cs="Times New Roman"/>
+          <w:b/>
+          <w:bCs/>
+        </w:rPr>
+        <w:t xml:space="preserve">potentially </w:t>
+      </w:r>
+      <w:r>
+        <w:rPr>
+          <w:rFonts w:ascii="Times New Roman" w:hAnsi="Times New Roman" w:cs="Times New Roman"/>
+          <w:b/>
+          <w:bCs/>
+        </w:rPr>
+        <w:t xml:space="preserve">consumption) </w:t>
+      </w:r>
+      <w:r>
+        <w:rPr>
+          <w:rFonts w:ascii="Times New Roman" w:hAnsi="Times New Roman" w:cs="Times New Roman"/>
+          <w:b/>
+          <w:bCs/>
+        </w:rPr>
+        <w:t xml:space="preserve">distributions </w:t>
+      </w:r>
+      <w:r>
+        <w:rPr>
+          <w:rFonts w:ascii="Times New Roman" w:hAnsi="Times New Roman" w:cs="Times New Roman"/>
+          <w:b/>
+          <w:bCs/>
+        </w:rPr>
+        <w:t xml:space="preserve">need not have a smooth right tail. </w:t>
+      </w:r>
+      <w:r>
+        <w:rPr>
+          <w:rFonts w:ascii="Times New Roman" w:hAnsi="Times New Roman" w:cs="Times New Roman"/>
+          <w:b/>
+          <w:bCs/>
+        </w:rPr>
+        <w:t>To that end</w:t>
+      </w:r>
+      <w:r>
+        <w:rPr>
+          <w:rFonts w:ascii="Times New Roman" w:hAnsi="Times New Roman" w:cs="Times New Roman"/>
+          <w:b/>
+          <w:bCs/>
+        </w:rPr>
+        <w:t>,</w:t>
+      </w:r>
+      <w:r>
+        <w:rPr>
+          <w:rFonts w:ascii="Times New Roman" w:hAnsi="Times New Roman" w:cs="Times New Roman"/>
+          <w:b/>
+          <w:bCs/>
+        </w:rPr>
+        <w:t xml:space="preserve"> we fit distributions that are more </w:t>
+      </w:r>
+      <w:r>
+        <w:rPr>
+          <w:rFonts w:ascii="Times New Roman" w:hAnsi="Times New Roman" w:cs="Times New Roman"/>
+          <w:b/>
+          <w:bCs/>
+        </w:rPr>
+        <w:t>suited to fit a distribution with an elongated right tail</w:t>
+      </w:r>
+      <w:r>
+        <w:rPr>
+          <w:rFonts w:ascii="Times New Roman" w:hAnsi="Times New Roman" w:cs="Times New Roman"/>
+          <w:b/>
+          <w:bCs/>
+        </w:rPr>
+        <w:t>.</w:t>
+      </w:r>
+      <w:r>
+        <w:rPr>
+          <w:rFonts w:ascii="Times New Roman" w:hAnsi="Times New Roman" w:cs="Times New Roman"/>
+          <w:b/>
+          <w:bCs/>
+        </w:rPr>
+        <w:t xml:space="preserve"> We first fit the Pareto distribution.</w:t>
+      </w:r>
+      <w:r>
+        <w:rPr>
+          <w:rFonts w:ascii="Times New Roman" w:hAnsi="Times New Roman" w:cs="Times New Roman"/>
+          <w:b/>
+          <w:bCs/>
+        </w:rPr>
+        <w:t xml:space="preserve"> </w:t>
+      </w:r>
+      <w:r>
+        <w:rPr>
+          <w:rFonts w:ascii="Times New Roman" w:hAnsi="Times New Roman" w:cs="Times New Roman"/>
         </w:rPr>
         <w:t>The analysis showed substantial deviations between the largest observed values and the fitted Pareto pattern, providing additional evidence that these observations were not simply large values from an otherwise regular tail.</w:t>
       </w:r>
@@ -29077,7 +29407,6 @@
         <w:rPr>
           <w:noProof/>
         </w:rPr>
-        <w:lastRenderedPageBreak/>
         <w:drawing>
           <wp:inline distT="0" distB="0" distL="0" distR="0" wp14:anchorId="34E928B6" wp14:editId="6FCB9020">
             <wp:extent cx="5943600" cy="3962400"/>
@@ -29203,6 +29532,7 @@
         <w:rPr>
           <w:rFonts w:ascii="Times New Roman" w:hAnsi="Times New Roman" w:cs="Times New Roman"/>
         </w:rPr>
+        <w:lastRenderedPageBreak/>
         <w:t>A GB2 distribution was fitted to the positive welfare values from the Malawi 1997 country dataset using weighted maximum likelihood and 2021 PPP-adjusted welfare measures. The analysis included the full sample and additional specifications that excluded the largest 1, 2, 5, 10, and 20 observations. All models converged, but the estimated shape parameters changed as extreme observations were removed, indicating that the upper tail has a significant influence on the fitted distribution. In the full-sample model, the second-largest observation had an empirical survival probability approximately 166 times larger than the probability predicted by the GB2 distribution. These results suggest that the highest welfare observations are unusually extreme relative to a smooth GB2 tail. However, the analysis is diagnostic and does not establish that these observations are erroneous; they may reflect genuine heterogeneity, measurement issues, or other features of the survey data.</w:t>
       </w:r>
     </w:p>
@@ -29217,7 +29547,6 @@
           <w:rFonts w:ascii="Times New Roman" w:hAnsi="Times New Roman" w:cs="Times New Roman"/>
           <w:noProof/>
         </w:rPr>
-        <w:lastRenderedPageBreak/>
         <w:drawing>
           <wp:inline distT="0" distB="0" distL="0" distR="0" wp14:anchorId="7F1CD88D" wp14:editId="1ED06B1F">
             <wp:extent cx="5943600" cy="3962400"/>
@@ -29234,7 +29563,7 @@
                     <pic:cNvPicPr/>
                   </pic:nvPicPr>
                   <pic:blipFill>
-                    <a:blip r:embed="rId23"/>
+                    <a:blip r:embed="rId24"/>
                     <a:stretch>
                       <a:fillRect/>
                     </a:stretch>
@@ -29334,6 +29663,7 @@
         <w:rPr>
           <w:rFonts w:ascii="Times New Roman" w:hAnsi="Times New Roman" w:cs="Times New Roman"/>
         </w:rPr>
+        <w:lastRenderedPageBreak/>
         <w:t>A weighted regression model was used to predict household welfare in Malawi 1997 based on the available characteristics in the survey: urban or rural location, household size, and subnational area. To obtain unbiased comparisons, five-fold cross-fitting was applied, meaning each household was predicted using a model estimated without that household. Households were flagged when the difference between observed and predicted log welfare exceeded three weighted standard deviations. The model explained approximately 39% of the variation in log welfare and flagged 118 households, representing about 1.1% of the sample weight. Most flagged households reported welfare substantially higher than predicted, although these flags indicate unusual observations for further review rather than confirmed errors.</w:t>
       </w:r>
     </w:p>
@@ -29366,7 +29696,7 @@
                     <pic:cNvPicPr/>
                   </pic:nvPicPr>
                   <pic:blipFill>
-                    <a:blip r:embed="rId24"/>
+                    <a:blip r:embed="rId25"/>
                     <a:stretch>
                       <a:fillRect/>
                     </a:stretch>
@@ -29400,7 +29730,6 @@
           <w:noProof/>
           <w:lang w:val="es-CL"/>
         </w:rPr>
-        <w:lastRenderedPageBreak/>
         <w:drawing>
           <wp:inline distT="0" distB="0" distL="0" distR="0" wp14:anchorId="7A4F3FA2" wp14:editId="2F150C3C">
             <wp:extent cx="5943600" cy="4457700"/>
@@ -29417,7 +29746,7 @@
                     <pic:cNvPicPr/>
                   </pic:nvPicPr>
                   <pic:blipFill>
-                    <a:blip r:embed="rId25"/>
+                    <a:blip r:embed="rId26"/>
                     <a:stretch>
                       <a:fillRect/>
                     </a:stretch>
@@ -29458,31 +29787,10 @@
         </w:rPr>
       </w:pPr>
     </w:p>
-    <w:p>
-      <w:pPr>
-        <w:rPr>
-          <w:rFonts w:ascii="Times New Roman" w:hAnsi="Times New Roman" w:cs="Times New Roman"/>
-        </w:rPr>
-      </w:pPr>
-    </w:p>
-    <w:p>
-      <w:pPr>
-        <w:rPr>
-          <w:rFonts w:ascii="Times New Roman" w:hAnsi="Times New Roman" w:cs="Times New Roman"/>
-        </w:rPr>
-      </w:pPr>
-    </w:p>
-    <w:p>
-      <w:pPr>
-        <w:rPr>
-          <w:rFonts w:ascii="Times New Roman" w:hAnsi="Times New Roman" w:cs="Times New Roman"/>
-        </w:rPr>
-      </w:pPr>
-    </w:p>
     <w:sectPr>
-      <w:footerReference w:type="even" r:id="rId26"/>
-      <w:footerReference w:type="default" r:id="rId27"/>
-      <w:footerReference w:type="first" r:id="rId28"/>
+      <w:footerReference w:type="even" r:id="rId27"/>
+      <w:footerReference w:type="default" r:id="rId28"/>
+      <w:footerReference w:type="first" r:id="rId29"/>
       <w:pgSz w:w="12240" w:h="15840"/>
       <w:pgMar w:top="1440" w:right="1440" w:bottom="1440" w:left="1440" w:header="720" w:footer="720" w:gutter="0"/>
       <w:cols w:space="720"/>
@@ -29698,11 +30006,11 @@
       <w:r>
         <w:instrText>HYPERLINK "mailto:nyonzan@worldbank.org"</w:instrText>
       </w:r>
-      <w:bookmarkStart w:id="8" w:name="_@_2F68CFCF323149E4B3B412CEC0E7FBD7Z"/>
+      <w:bookmarkStart w:id="9" w:name="_@_2F68CFCF323149E4B3B412CEC0E7FBD7Z"/>
       <w:r>
         <w:fldChar w:fldCharType="separate"/>
       </w:r>
-      <w:bookmarkEnd w:id="8"/>
+      <w:bookmarkEnd w:id="9"/>
       <w:r>
         <w:rPr>
           <w:rStyle w:val="Mention"/>
@@ -29722,11 +30030,11 @@
       <w:r>
         <w:instrText>HYPERLINK "mailto:ykimura1@worldbank.org"</w:instrText>
       </w:r>
-      <w:bookmarkStart w:id="9" w:name="_@_BE352B7C894C432C94C0D6158BC4BDB5Z"/>
+      <w:bookmarkStart w:id="10" w:name="_@_BE352B7C894C432C94C0D6158BC4BDB5Z"/>
       <w:r>
         <w:fldChar w:fldCharType="separate"/>
       </w:r>
-      <w:bookmarkEnd w:id="9"/>
+      <w:bookmarkEnd w:id="10"/>
       <w:r>
         <w:rPr>
           <w:rStyle w:val="Mention"/>
@@ -29739,6 +30047,22 @@
       </w:r>
       <w:r>
         <w:t xml:space="preserve"> let me know if this structure makes sense! I just had wifi today (Saturday) so I am trying to advance as much as possible. </w:t>
+      </w:r>
+    </w:p>
+  </w:comment>
+  <w:comment w:id="8" w:author="Nishant Yonzan" w:date="2026-09-13T11:29:00Z" w:initials="NY">
+    <w:p>
+      <w:pPr>
+        <w:pStyle w:val="CommentText"/>
+      </w:pPr>
+      <w:r>
+        <w:rPr>
+          <w:rStyle w:val="CommentReference"/>
+        </w:rPr>
+        <w:annotationRef/>
+      </w:r>
+      <w:r>
+        <w:t>Thanks for getting this started, Daniela! Looks great. I have a couple of minor suggestions in the text. Let's try to meet either Monday afternoon or Tuesday to go over the presentation. Thanks!</w:t>
       </w:r>
     </w:p>
   </w:comment>
@@ -29755,6 +30079,7 @@
   <w15:commentEx w15:paraId="7F992D3A" w15:done="0"/>
   <w15:commentEx w15:paraId="635781DD" w15:done="0"/>
   <w15:commentEx w15:paraId="2825E104" w15:done="0"/>
+  <w15:commentEx w15:paraId="3BDFE7F0" w15:paraIdParent="2825E104" w15:done="0"/>
 </w15:commentsEx>
 </file>
 
@@ -29780,6 +30105,7 @@
   <w16cex:commentExtensible w16cex:durableId="194A6285" w16cex:dateUtc="2026-09-03T13:22:00Z"/>
   <w16cex:commentExtensible w16cex:durableId="7F7FC430" w16cex:dateUtc="2026-08-19T11:54:00Z"/>
   <w16cex:commentExtensible w16cex:durableId="72F0BA2A" w16cex:dateUtc="2026-09-12T19:07:00Z"/>
+  <w16cex:commentExtensible w16cex:durableId="1CA7FBA8" w16cex:dateUtc="2026-09-13T15:29:00Z"/>
 </w16cex:commentsExtensible>
 </file>
 
@@ -29793,6 +30119,7 @@
   <w16cid:commentId w16cid:paraId="7F992D3A" w16cid:durableId="194A6285"/>
   <w16cid:commentId w16cid:paraId="635781DD" w16cid:durableId="7F7FC430"/>
   <w16cid:commentId w16cid:paraId="2825E104" w16cid:durableId="72F0BA2A"/>
+  <w16cid:commentId w16cid:paraId="3BDFE7F0" w16cid:durableId="1CA7FBA8"/>
 </w16cid:commentsIds>
 </file>
 

</xml_diff>